<commit_message>
Update paper with new live evidence (multi-variable, EO quality, non-ideal MMU)
Folds this session's quota-free results into the manuscript:
- §6.5 multi-variable live optimization (4- and 5-DOF closed-form optima
  recovered on real flowsheets) + Table 4
- §6.6 surrogate-EO approximation quality (cross-val R²=1.0, 0.24% prediction
  error at the optimum)
- §6.7 non-ideal model-form uncertainty (methanol/water, 140% vapour-fraction
  spread across activity models)
- §4.4 persistent-pool DE (init amortized across generations)
- §6.8 benchmark: corrected convergence framing (19 executed / 6 inconclusive;
  no aggregate "100% convergence" asserted from a default field)
- §7 scope/scale paragraph: honest industrial-scale limits (O(n^2) surrogate
  budget, single-runtime, native-EO barrier)
- test count 558 -> 564; abstract updated

Co-Authored-By: Claude Opus 4.8 <noreply@anthropic.com>
</commit_message>
<xml_diff>
--- a/backend/DWSIM_Agentic_AI_paper.docx
+++ b/backend/DWSIM_Agentic_AI_paper.docx
@@ -66,7 +66,7 @@
           <w:b w:val="0"/>
           <w:i w:val="0"/>
         </w:rPr>
-        <w:t>Process flowsheet design and optimization are central to chemical engineering yet remain expert-, time-, and licence-intensive, with the field dominated by closed commercial suites. We present an agentic artificial-intelligence system that designs, builds, solves, and optimizes process flowsheets in the open-source steady-state simulator DWSIM directly from natural-language instructions. A tool-using large-language-model (LLM) agent executes a reason-act-observe loop over a 107-tool action space, with proactive retrieval-augmented generation, a deterministic safety validator, a synchronous quality guard, and provider-agnostic failover; it is coupled to the DWSIM .NET engine through a pythonnet integration bridge providing atomic build-and-solve, graph-based recycle auto-tearing, energy-stream injection, and read-back-after-write verification of every property write. Above a broad solver stack (CMA-ES, differential evolution, NSGA-II, NLopt, Bayesian/efficient global optimization, and SALib global sensitivity) we contribute five capabilities that close specific gaps between a black-box wrapper and a commercial optimizer: a provably-convergent derivative-free trust-region surrogate equation-oriented method; an infeasible-path simultaneous tear-and-optimize formulation; a multi-process parallel evaluator; a total-annualized-cost economic objective; and a thermodynamic-intelligence layer that auto-selects a theory-appropriate, engine-instantiable property package and quantifies thermodynamic model-form uncertainty rather than asserting fidelity parity. The system is evaluated at four levels of increasing realism: 558 automated component tests; exact agreement with closed-form and analytic optima for the optimizer stack (single-objective 5/5 standard functions, an NSGA-II Pareto front reproduced to a maximum deviation of 2.1x10^-5, and Sobol indices to 1.1x10^-3); live demonstrations on a DWSIM v9.0.5 engine, including a capstone case study (two-stage compression with intercooling) in which the optimizer drives a real flowsheet to an interior optimum matching the textbook closed-form value P*=sqrt(P1 P2)=3.162 bar by three independent methods; and a fully-wired four-condition component-attribution ablation. We position the contribution as Aspen-level optimization methodology over an open simulator, not Aspen-level simulation: two limitations - thermodynamic fidelity and true native equation-oriented optimization - are fundamental to building upon DWSIM and are stated explicitly, with the fidelity gap measured rather than hidden. The complete system, a content-hashed 25-task benchmark, append-only agent transcripts, and the ablation harness are released for reproducibility.</w:t>
+        <w:t>Process flowsheet design and optimization are central to chemical engineering yet remain expert-, time-, and licence-intensive, with the field dominated by closed commercial suites. We present an agentic artificial-intelligence system that designs, builds, solves, and optimizes process flowsheets in the open-source steady-state simulator DWSIM directly from natural-language instructions. A tool-using large-language-model (LLM) agent executes a reason-act-observe loop over a 107-tool action space, with proactive retrieval-augmented generation, a deterministic safety validator, a synchronous quality guard, and provider-agnostic failover; it is coupled to the DWSIM .NET engine through a pythonnet integration bridge providing atomic build-and-solve, graph-based recycle auto-tearing, energy-stream injection, and read-back-after-write verification of every property write. Above a broad solver stack (CMA-ES, differential evolution, NSGA-II, NLopt, Bayesian/efficient global optimization, and SALib global sensitivity) we contribute five capabilities that close specific gaps between a black-box wrapper and a commercial optimizer: a provably-convergent derivative-free trust-region surrogate equation-oriented method; an infeasible-path simultaneous tear-and-optimize formulation; a multi-process parallel evaluator; a total-annualized-cost economic objective; and a thermodynamic-intelligence layer that auto-selects a theory-appropriate, engine-instantiable property package and quantifies thermodynamic model-form uncertainty rather than asserting fidelity parity. The system is evaluated at four levels of increasing realism: 564 automated component tests; exact agreement with closed-form and analytic optima for the optimizer stack (single-objective 5/5 standard functions, an NSGA-II Pareto front reproduced to a maximum deviation of 2.1x10^-5, and Sobol indices to 1.1x10^-3); live demonstrations on a DWSIM v9.0.5 engine, including a capstone case study (two-stage compression with intercooling) in which the optimizer drives a real flowsheet to an interior optimum matching the textbook closed-form value P*=sqrt(P1 P2)=3.162 bar by three independent methods, multi-variable extensions recovering four- and five-dimensional closed-form optima on real flowsheets, a surrogate-EO quality audit (cross-validated R-squared 1.0, 0.24% prediction error at the optimum), and a strongly non-ideal mixture exhibiting a 140% vapour-fraction spread across activity-coefficient packages that quantifies thermodynamic model-form uncertainty; and a fully-wired four-condition component-attribution ablation. We position the contribution as Aspen-level optimization methodology over an open simulator, not Aspen-level simulation: two limitations - thermodynamic fidelity and true native equation-oriented optimization - are fundamental to building upon DWSIM and are stated explicitly, with the fidelity gap measured rather than hidden. The complete system, a content-hashed 25-task benchmark, append-only agent transcripts, and the ablation harness are released for reproducibility.</w:t>
       </w:r>
     </w:p>
     <w:p>
@@ -194,7 +194,7 @@
         <w:t xml:space="preserve">A reproducibility package — </w:t>
       </w:r>
       <w:r>
-        <w:t>558 component tests, a content-hashed 25-task benchmark with explicit success criteria, append-only reason-act-observe transcripts, and a fully-wired four-condition ablation harness with non-parametric statistics.</w:t>
+        <w:t>564 component tests, a content-hashed 25-task benchmark with explicit success criteria, append-only reason-act-observe transcripts, and a fully-wired four-condition ablation harness with non-parametric statistics.</w:t>
       </w:r>
     </w:p>
     <w:p>
@@ -737,7 +737,7 @@
           <w:b w:val="0"/>
           <w:i w:val="0"/>
         </w:rPr>
-        <w:t>DWSIM hosts a single common-language-runtime instance per process. To evaluate a batch of designs concurrently (the primitive needed by population optimizers and sweeps), a process pool is used in which each worker initializes its own runtime and loads a copy of the flowsheet once via a pool initializer. Correctness is exact (parallel equals serial, order preserved); the speed-up is workload-dependent, because per-worker runtime initialization (~30 s) dominates small batches and pays off only with a persistent pool over many generations - a limitation we report rather than obscure.</w:t>
+        <w:t>DWSIM hosts a single common-language-runtime instance per process. To evaluate a batch of designs concurrently (the primitive needed by population optimizers and sweeps), a process pool is used in which each worker initializes its own runtime and loads a copy of the flowsheet once via a pool initializer. Correctness is exact (parallel equals serial, order preserved); the speed-up is workload-dependent, because per-worker runtime initialization (~30 s) dominates small batches and pays off only with a persistent pool over many generations - a limitation we report rather than obscure. To realize that amortization, a differential-evolution optimizer is provided that creates the worker pool ONCE and evaluates every generation's whole population through it, so the per-worker initialization is paid once over generations x population solves rather than per batch; a test confirms it outperforms re-initializing the pool each generation.</w:t>
       </w:r>
     </w:p>
     <w:p>
@@ -1063,7 +1063,7 @@
           <w:b w:val="0"/>
           <w:i w:val="0"/>
         </w:rPr>
-        <w:t>The automated suite reports 558 passed and 5 skipped (the skips require a live DWSIM and self-skip), covering tool selection and sequencing, optimizer convergence on analytic objectives, the recycle and energy-stream passes, provider failover, history normalization, the bridge regression tests, the thermodynamic-model registry, and the ablation-runner round-trip.</w:t>
+        <w:t>The automated suite reports 564 passed and 1 skipped (the skips require a live DWSIM and self-skip), covering tool selection and sequencing, optimizer convergence on analytic objectives, the recycle and energy-stream passes, provider failover, history normalization, the bridge regression tests, the thermodynamic-model registry, and the ablation-runner round-trip.</w:t>
       </w:r>
     </w:p>
     <w:p>
@@ -1579,7 +1579,7 @@
         <w:pStyle w:val="Heading2"/>
       </w:pPr>
       <w:r>
-        <w:t>6.5 Thermodynamic model-form uncertainty (live)</w:t>
+        <w:t>6.5 Multi-variable live optimization</w:t>
       </w:r>
     </w:p>
     <w:p>
@@ -1591,15 +1591,149 @@
           <w:b w:val="0"/>
           <w:i w:val="0"/>
         </w:rPr>
-        <w:t>A water-heater flowsheet solved under Peng-Robinson, Soave-Redlich-Kwong, and Steam Tables yields a maximum relative output spread of 0.07%, reported as robust - because DWSIM applies a corrected liquid-density model across packages. The capability reports robustness truthfully rather than manufacturing sensitivity; the model-dependent path (large spread, most-sensitive output identified) is covered by unit tests, and the comparison packages are auto-selected for the chemistry.</w:t>
+        <w:t>To move the validated live ceiling above a single decision variable, an N-stage compression train with intercooling is optimized over its intermediate pressures. For equal-efficiency stages the minimum-power optimum is the geometric progression with equal stage ratios. Two live cases were run: a five-stage train (1 -&gt; 32 bar, four decision variables, optimum [2,4,8,16] bar) and a six-stage train (1 -&gt; 64 bar, five decision variables, optimum [2,4,8,16,32] bar). In both, the optimizer recovers the multi-dimensional optimum to within real-gas tolerance with total power at the analytic minimum (Table 4). This demonstrates simultaneous multi-variable optimization on a real flowsheet, not only the single-variable cases.</w:t>
       </w:r>
     </w:p>
     <w:p>
       <w:pPr>
+        <w:jc w:val="both"/>
+      </w:pPr>
+      <w:r>
+        <w:rPr>
+          <w:b w:val="0"/>
+          <w:i/>
+          <w:sz w:val="18"/>
+        </w:rPr>
+        <w:t>Table 4. Multi-variable live optimization: the optimizer recovers 4- and 5-dimensional closed-form optima on real DWSIM flowsheets.</w:t>
+      </w:r>
+    </w:p>
+    <w:tbl>
+      <w:tblPr>
+        <w:tblStyle w:val="LightGrid-Accent1"/>
+        <w:tblW w:type="auto" w:w="0"/>
+        <w:tblLook w:firstColumn="1" w:firstRow="1" w:lastColumn="0" w:lastRow="0" w:noHBand="0" w:noVBand="1" w:val="04A0"/>
+      </w:tblPr>
+      <w:tblGrid>
+        <w:gridCol w:w="2880"/>
+        <w:gridCol w:w="2880"/>
+        <w:gridCol w:w="2880"/>
+      </w:tblGrid>
+      <w:tr>
+        <w:tc>
+          <w:tcPr>
+            <w:tcW w:type="dxa" w:w="2880"/>
+          </w:tcPr>
+          <w:p>
+            <w:r/>
+            <w:r>
+              <w:rPr>
+                <w:b/>
+              </w:rPr>
+              <w:t>Case (DOF)</w:t>
+            </w:r>
+          </w:p>
+        </w:tc>
+        <w:tc>
+          <w:tcPr>
+            <w:tcW w:type="dxa" w:w="2880"/>
+          </w:tcPr>
+          <w:p>
+            <w:r/>
+            <w:r>
+              <w:rPr>
+                <w:b/>
+              </w:rPr>
+              <w:t>Analytic optimum (bar)</w:t>
+            </w:r>
+          </w:p>
+        </w:tc>
+        <w:tc>
+          <w:tcPr>
+            <w:tcW w:type="dxa" w:w="2880"/>
+          </w:tcPr>
+          <w:p>
+            <w:r/>
+            <w:r>
+              <w:rPr>
+                <w:b/>
+              </w:rPr>
+              <w:t>Optimizer (bar)</w:t>
+            </w:r>
+          </w:p>
+        </w:tc>
+      </w:tr>
+      <w:tr>
+        <w:tc>
+          <w:tcPr>
+            <w:tcW w:type="dxa" w:w="2880"/>
+          </w:tcPr>
+          <w:p>
+            <w:r>
+              <w:t>5-stage (4 DOF)</w:t>
+            </w:r>
+          </w:p>
+        </w:tc>
+        <w:tc>
+          <w:tcPr>
+            <w:tcW w:type="dxa" w:w="2880"/>
+          </w:tcPr>
+          <w:p>
+            <w:r>
+              <w:t>[2, 4, 8, 16]</w:t>
+            </w:r>
+          </w:p>
+        </w:tc>
+        <w:tc>
+          <w:tcPr>
+            <w:tcW w:type="dxa" w:w="2880"/>
+          </w:tcPr>
+          <w:p>
+            <w:r>
+              <w:t>[2.01, 4.05, 8.11, 16.18]</w:t>
+            </w:r>
+          </w:p>
+        </w:tc>
+      </w:tr>
+      <w:tr>
+        <w:tc>
+          <w:tcPr>
+            <w:tcW w:type="dxa" w:w="2880"/>
+          </w:tcPr>
+          <w:p>
+            <w:r>
+              <w:t>6-stage (5 DOF)</w:t>
+            </w:r>
+          </w:p>
+        </w:tc>
+        <w:tc>
+          <w:tcPr>
+            <w:tcW w:type="dxa" w:w="2880"/>
+          </w:tcPr>
+          <w:p>
+            <w:r>
+              <w:t>[2, 4, 8, 16, 32]</w:t>
+            </w:r>
+          </w:p>
+        </w:tc>
+        <w:tc>
+          <w:tcPr>
+            <w:tcW w:type="dxa" w:w="2880"/>
+          </w:tcPr>
+          <w:p>
+            <w:r>
+              <w:t>[2.02, 4.08, 8.22, 16.47, 32.71]</w:t>
+            </w:r>
+          </w:p>
+        </w:tc>
+      </w:tr>
+    </w:tbl>
+    <w:p/>
+    <w:p>
+      <w:pPr>
         <w:pStyle w:val="Heading2"/>
       </w:pPr>
       <w:r>
-        <w:t>6.6 Live 25-task benchmark</w:t>
+        <w:t>6.6 Surrogate-EO approximation quality</w:t>
       </w:r>
     </w:p>
     <w:p>
@@ -1611,7 +1745,7 @@
           <w:b w:val="0"/>
           <w:i w:val="0"/>
         </w:rPr>
-        <w:t>Run crash-isolated (one subprocess per task) against the live engine, the benchmark is partially rate-limited because each agent request is approximately twenty-two thousand tokens. The best combined result to date is 24% strict overall and 32% over the tasks actually executed; the agent demonstrably builds and solves real flowsheets, with the water-heater and pump tasks passing cleanly against live physics. This figure is quota- and scoring-limited and is not presented as a clean capability ceiling.</w:t>
+        <w:t>Because the equation-oriented optimizer is surrogate-based, its honesty depends on knowing when the surrogate predicts the flowsheet. Run live on the water-heater duty objective, the quadratic surrogate gives an in-sample and k-fold cross-validated R-squared of 1.0, and the prediction error at the reported optimum - a real DWSIM solve at the predicted optimum versus the surrogate's prediction there - is 0.24% (67.74 vs 67.58 kW) after one adaptive refinement. The cross-validated R-squared is the honest guard: when it falls below 0.70, as on the analytic Rosenbrock valley whose curvature defeats a quadratic surrogate, the EO optimum is explicitly flagged rather than trusted blindly.</w:t>
       </w:r>
     </w:p>
     <w:p>
@@ -1619,7 +1753,47 @@
         <w:pStyle w:val="Heading2"/>
       </w:pPr>
       <w:r>
-        <w:t>6.7 Component-attribution ablation</w:t>
+        <w:t>6.7 Thermodynamic model-form uncertainty (live)</w:t>
+      </w:r>
+    </w:p>
+    <w:p>
+      <w:pPr>
+        <w:jc w:val="both"/>
+      </w:pPr>
+      <w:r>
+        <w:rPr>
+          <w:b w:val="0"/>
+          <w:i w:val="0"/>
+        </w:rPr>
+        <w:t>A water-heater flowsheet solved under Peng-Robinson, Soave-Redlich-Kwong, and Steam Tables yields a maximum relative output spread of 0.07%, reported as robust - DWSIM applies a corrected liquid-density model across packages. The complementary, decision-relevant case is a strongly non-ideal mixture: the same flowsheet for methanol/water (50/50 mol) heated to 75 C under NRTL, UNIQUAC, Wilson and Modified UNIFAC gives a heated-stream vapour fraction of 0.28 / 0.00 / 0.29 / 0.27 - a 140% spread, with UNIQUAC predicting a single liquid phase where the others predict about 28% vaporization. The engineering result (is there a vapour phase, and how much) depends entirely on the package, and the platform flags it as model-dependent in one command rather than reporting one unqualified number - quantifying the fidelity exposure a commercial tool leaves implicit.</w:t>
+      </w:r>
+    </w:p>
+    <w:p>
+      <w:pPr>
+        <w:pStyle w:val="Heading2"/>
+      </w:pPr>
+      <w:r>
+        <w:t>6.8 Live 25-task benchmark</w:t>
+      </w:r>
+    </w:p>
+    <w:p>
+      <w:pPr>
+        <w:jc w:val="both"/>
+      </w:pPr>
+      <w:r>
+        <w:rPr>
+          <w:b w:val="0"/>
+          <w:i w:val="0"/>
+        </w:rPr>
+        <w:t>Run crash-isolated (one subprocess per task) against the live engine, the benchmark is partially rate-limited because each agent request is approximately twenty-two thousand tokens. The best combined result to date is 24% strict overall and 32% over the tasks actually executed; the agent demonstrably builds and solves real flowsheets, with the water-heater and pump tasks passing cleanly against live physics. Of the 25 tasks, 19 executed; the remaining six never ran due to rate-limiting and are reported as inconclusive rather than failed. This figure is quota- and scoring-limited and is not presented as a clean capability ceiling. We deliberately avoid an aggregate 'solver-convergence' percentage: the harness was corrected so the per-task convergence field records the real solver flag (and not-run for unexecuted tasks), so a trustworthy convergence figure awaits a re-run rather than being asserted from a default value.</w:t>
+      </w:r>
+    </w:p>
+    <w:p>
+      <w:pPr>
+        <w:pStyle w:val="Heading2"/>
+      </w:pPr>
+      <w:r>
+        <w:t>6.9 Component-attribution ablation</w:t>
       </w:r>
     </w:p>
     <w:p>
@@ -1653,7 +1827,7 @@
         <w:t xml:space="preserve">What is established. </w:t>
       </w:r>
       <w:r>
-        <w:t>The system is designed, implemented, component-validated (558 tests), and demonstrated end-to-end on a live DWSIM engine, with optimization methodology at commercial level validated against known optima - most strongly by the compression capstone, which matches a closed-form result by three independent methods.</w:t>
+        <w:t>The system is designed, implemented, component-validated (564 tests), and demonstrated end-to-end on a live DWSIM engine, with optimization methodology at commercial level validated against known optima - most strongly by the compression capstone, which matches a closed-form result by three independent methods.</w:t>
       </w:r>
     </w:p>
     <w:p>
@@ -1668,6 +1842,20 @@
       </w:r>
       <w:r>
         <w:t>Two gaps are not closable by code because the system builds upon DWSIM rather than replacing it: (a) thermodynamic fidelity, since DWSIM's models are not validated against decades of industrial data the way a commercial databank is; and (b) true native equation-oriented optimization, since DWSIM does not expose its equation system and the EO here is therefore a validated surrogate. We do not claim Aspen-level simulation. Limitation (a) is, however, measured rather than hidden: the thermodynamic-intelligence layer reports how much a result depends on the package choice.</w:t>
+      </w:r>
+    </w:p>
+    <w:p>
+      <w:pPr>
+        <w:jc w:val="both"/>
+      </w:pPr>
+      <w:r>
+        <w:rPr>
+          <w:b/>
+        </w:rPr>
+        <w:t xml:space="preserve">Scope and scale. </w:t>
+      </w:r>
+      <w:r>
+        <w:t>The demonstrated live optimization scope is small-to-moderate, not industrial: validated live cases reach five simultaneous continuous decision variables on real flowsheets with known optima. Two factors bound the practical ceiling. First, the surrogate-EO sample budget grows as the square of the number of variables (a full quadratic in n needs O(n^2) DWSIM solves per fit), so tens of degrees of freedom become expensive; the trust-region scheme localizes but does not remove this. Second, solves are serial on one in-process runtime; the persistent worker pool (Section 4.4) amortizes initialization but the single-runtime constraint remains. Plant-wide, many-recycle, or reactive-distillation problems with tens-to-hundreds of degrees of freedom are therefore out of present scope; reaching them would require native equation-oriented solving (e.g. an algebraic re-modelling in IDAES/Pyomo) rather than a surrogate over a sequential-modular engine. The contribution is deliberately framed as optimization methodology validated against known optima, not industrial-scale flowsheet optimization.</w:t>
       </w:r>
     </w:p>
     <w:p>

</xml_diff>